<commit_message>
Embed real Tasca da Maria photos into both documents
- Extraí as 5 fotografias reais fornecidas pelo cliente e incorporei-as
  como miniaturas reais nos anúncios de imagem e carrossel e como imagem
  de capa (ambiente do restaurante) em ambos os documentos.
- Mapeamento: mesa/loiça bordada (anúncio imagem notoriedade), petiscos
  para partilhar (carrossel notoriedade), peixe fresco grelhado (imagem
  contactos, copy ajustada de bacalhau para peixe grelhado), arroz de
  carne (carrossel contactos). Anúncios de vídeo mantêm placeholder com
  o formato (fotograma de capa a selecionar no Ads Manager: 002/007.mp4).
- Tabela horizontal do resumo e cartões de anúncio atualizados com as
  fotos; nota de rodapé revista.

Co-Authored-By: Claude Opus 4.8 <noreply@anthropic.com>
Claude-Session: https://claude.ai/code/session_01FEyCRLgfKdTeSTq5pQ8WJ6
</commit_message>
<xml_diff>
--- a/Tasca da Maria Meta Ads Strategy/Tasca da Maria | Proposta de Estratégia Meta Ads.docx
+++ b/Tasca da Maria Meta Ads Strategy/Tasca da Maria | Proposta de Estratégia Meta Ads.docx
@@ -25,7 +25,7 @@
     </w:p>
     <w:p>
       <w:pPr>
-        <w:spacing w:before="40" w:after="280" w:lineRule="auto" w:line="269"/>
+        <w:spacing w:before="40" w:after="160" w:lineRule="auto" w:line="269"/>
         <w:jc w:val="center"/>
       </w:pPr>
       <w:r>
@@ -37,6 +37,46 @@
           <w:sz w:val="20"/>
         </w:rPr>
         <w:t>Póvoa de Varzim  ·  Norte de Portugal</w:t>
+      </w:r>
+    </w:p>
+    <w:p>
+      <w:pPr>
+        <w:spacing w:after="200"/>
+        <w:jc w:val="center"/>
+      </w:pPr>
+      <w:r>
+        <w:drawing>
+          <wp:inline xmlns:a="http://schemas.openxmlformats.org/drawingml/2006/main" xmlns:pic="http://schemas.openxmlformats.org/drawingml/2006/picture">
+            <wp:extent cx="6120000" cy="2370480"/>
+            <wp:docPr id="1" name="Picture 1"/>
+            <wp:cNvGraphicFramePr>
+              <a:graphicFrameLocks noChangeAspect="1"/>
+            </wp:cNvGraphicFramePr>
+            <a:graphic>
+              <a:graphicData uri="http://schemas.openxmlformats.org/drawingml/2006/picture">
+                <pic:pic>
+                  <pic:nvPicPr>
+                    <pic:cNvPr id="0" name="cover_banner.jpg"/>
+                    <pic:cNvPicPr/>
+                  </pic:nvPicPr>
+                  <pic:blipFill>
+                    <a:blip r:embed="rId9"/>
+                    <a:stretch>
+                      <a:fillRect/>
+                    </a:stretch>
+                  </pic:blipFill>
+                  <pic:spPr>
+                    <a:xfrm>
+                      <a:off x="0" y="0"/>
+                      <a:ext cx="6120000" cy="2370480"/>
+                    </a:xfrm>
+                    <a:prstGeom prst="rect"/>
+                  </pic:spPr>
+                </pic:pic>
+              </a:graphicData>
+            </a:graphic>
+          </wp:inline>
+        </w:drawing>
       </w:r>
     </w:p>
     <w:tbl>
@@ -5703,7 +5743,7 @@
                 <w:color w:val="23282B"/>
                 <w:sz w:val="21"/>
               </w:rPr>
-              <w:t>Biblioteca Multimédia da conta: 57 fotografias profissionais (ficheiros 791A7678–791A7763.JPG) e 8 vídeos curtos (001.mp4 a 008.mp4, entre 15 e 30 segundos). Há, por isso, material para testar os três formatos: imagem, vídeo e carrossel. Nota: a conta está 'por regularizar', por isso não conseguimos ainda extrair automaticamente as miniaturas dos ficheiros; os nomes indicados abaixo são sugestões a confirmar visualmente no Ads Manager.</w:t>
+              <w:t>Biblioteca Multimédia da conta: 57 fotografias profissionais e 8 vídeos curtos (001–008.mp4, 15–30s) — material para testar imagem, vídeo e carrossel. As miniaturas reais das fotos escolhidas já estão incluídas neste documento; os anúncios de vídeo usam ficheiros da Biblioteca (ex.: 002.mp4, 007.mp4), cujo fotograma de capa é selecionado no Ads Manager.</w:t>
             </w:r>
           </w:p>
         </w:tc>
@@ -6754,23 +6794,63 @@
           </w:tcPr>
           <w:p>
             <w:pPr>
+              <w:spacing w:after="40"/>
+              <w:jc w:val="center"/>
+            </w:pPr>
+            <w:r>
+              <w:drawing>
+                <wp:inline xmlns:a="http://schemas.openxmlformats.org/drawingml/2006/main" xmlns:pic="http://schemas.openxmlformats.org/drawingml/2006/picture">
+                  <wp:extent cx="1620000" cy="2025000"/>
+                  <wp:docPr id="2" name="Picture 2"/>
+                  <wp:cNvGraphicFramePr>
+                    <a:graphicFrameLocks noChangeAspect="1"/>
+                  </wp:cNvGraphicFramePr>
+                  <a:graphic>
+                    <a:graphicData uri="http://schemas.openxmlformats.org/drawingml/2006/picture">
+                      <pic:pic>
+                        <pic:nvPicPr>
+                          <pic:cNvPr id="0" name="thumb_2.jpg"/>
+                          <pic:cNvPicPr/>
+                        </pic:nvPicPr>
+                        <pic:blipFill>
+                          <a:blip r:embed="rId10"/>
+                          <a:stretch>
+                            <a:fillRect/>
+                          </a:stretch>
+                        </pic:blipFill>
+                        <pic:spPr>
+                          <a:xfrm>
+                            <a:off x="0" y="0"/>
+                            <a:ext cx="1620000" cy="2025000"/>
+                          </a:xfrm>
+                          <a:prstGeom prst="rect"/>
+                        </pic:spPr>
+                      </pic:pic>
+                    </a:graphicData>
+                  </a:graphic>
+                </wp:inline>
+              </w:drawing>
+            </w:r>
+          </w:p>
+          <w:p>
+            <w:pPr>
               <w:spacing w:after="20"/>
               <w:jc w:val="center"/>
             </w:pPr>
             <w:r>
               <w:rPr>
                 <w:rFonts w:ascii="Calibri" w:hAnsi="Calibri" w:cs="Calibri"/>
-                <w:b w:val="0"/>
-                <w:i w:val="0"/>
-                <w:color w:val="C1602E"/>
-                <w:sz w:val="52"/>
-              </w:rPr>
-              <w:t>🖼</w:t>
-            </w:r>
-          </w:p>
-          <w:p>
-            <w:pPr>
-              <w:spacing w:after="20"/>
+                <w:b/>
+                <w:i w:val="0"/>
+                <w:color w:val="9C4A20"/>
+                <w:sz w:val="17"/>
+              </w:rPr>
+              <w:t>FORMATO: IMAGEM</w:t>
+            </w:r>
+          </w:p>
+          <w:p>
+            <w:pPr>
+              <w:spacing w:before="60" w:after="0"/>
               <w:jc w:val="center"/>
             </w:pPr>
             <w:r>
@@ -6778,15 +6858,15 @@
                 <w:rFonts w:ascii="Calibri" w:hAnsi="Calibri" w:cs="Calibri"/>
                 <w:b/>
                 <w:i w:val="0"/>
-                <w:color w:val="9C4A20"/>
+                <w:color w:val="0A3A46"/>
                 <w:sz w:val="17"/>
               </w:rPr>
-              <w:t>FORMATO: IMAGEM</w:t>
-            </w:r>
-          </w:p>
-          <w:p>
-            <w:pPr>
-              <w:spacing w:after="0"/>
+              <w:t>Ficheiro:</w:t>
+            </w:r>
+          </w:p>
+          <w:p>
+            <w:pPr>
+              <w:spacing w:after="60"/>
               <w:jc w:val="center"/>
             </w:pPr>
             <w:r>
@@ -6794,42 +6874,10 @@
                 <w:rFonts w:ascii="Calibri" w:hAnsi="Calibri" w:cs="Calibri"/>
                 <w:b/>
                 <w:i w:val="0"/>
-                <w:color w:val="6B6157"/>
-                <w:sz w:val="16"/>
-              </w:rPr>
-              <w:t>MINIATURA (inserir)</w:t>
-            </w:r>
-          </w:p>
-          <w:p>
-            <w:pPr>
-              <w:spacing w:before="80" w:after="0"/>
-              <w:jc w:val="center"/>
-            </w:pPr>
-            <w:r>
-              <w:rPr>
-                <w:rFonts w:ascii="Calibri" w:hAnsi="Calibri" w:cs="Calibri"/>
-                <w:b/>
-                <w:i w:val="0"/>
-                <w:color w:val="0A3A46"/>
-                <w:sz w:val="17"/>
-              </w:rPr>
-              <w:t>Ficheiro da Biblioteca:</w:t>
-            </w:r>
-          </w:p>
-          <w:p>
-            <w:pPr>
-              <w:spacing w:after="60"/>
-              <w:jc w:val="center"/>
-            </w:pPr>
-            <w:r>
-              <w:rPr>
-                <w:rFonts w:ascii="Calibri" w:hAnsi="Calibri" w:cs="Calibri"/>
-                <w:b/>
-                <w:i w:val="0"/>
                 <w:color w:val="9C4A20"/>
-                <w:sz w:val="20"/>
-              </w:rPr>
-              <w:t>791A7678.JPG (imagem) — confirmar no Ads Manager</w:t>
+                <w:sz w:val="18"/>
+              </w:rPr>
+              <w:t>Foto da mesa (Biblioteca) — a confirmar no Ads Manager</w:t>
             </w:r>
           </w:p>
           <w:p>
@@ -6900,7 +6948,7 @@
                 <w:color w:val="23282B"/>
                 <w:sz w:val="20"/>
               </w:rPr>
-              <w:t>Fachada/esplanada com o mar ao fundo (ou marisco em grande plano)</w:t>
+              <w:t>Mesa posta com a loiça da casa e guardanapo bordado 'Tasca Maria'</w:t>
             </w:r>
           </w:p>
           <w:p>
@@ -6925,7 +6973,7 @@
                 <w:color w:val="6B6157"/>
                 <w:sz w:val="20"/>
               </w:rPr>
-              <w:t>O cenário de frente-mar é o cartão de visita e diferencia a Tasca; a foto parada é o formato mais simples e barato para dar a conhecer.</w:t>
+              <w:t>Detalhe de marca acolhedor, que transmite cuidado e qualidade — um bom cartão de visita.</w:t>
             </w:r>
           </w:p>
           <w:p>
@@ -7179,18 +7227,34 @@
           </w:tcPr>
           <w:p>
             <w:pPr>
+              <w:spacing w:after="40"/>
+              <w:jc w:val="center"/>
+            </w:pPr>
+            <w:r>
+              <w:rPr>
+                <w:rFonts w:ascii="Calibri" w:hAnsi="Calibri" w:cs="Calibri"/>
+                <w:b w:val="0"/>
+                <w:i w:val="0"/>
+                <w:color w:val="C1602E"/>
+                <w:sz w:val="52"/>
+              </w:rPr>
+              <w:t>🎥</w:t>
+            </w:r>
+          </w:p>
+          <w:p>
+            <w:pPr>
               <w:spacing w:after="20"/>
               <w:jc w:val="center"/>
             </w:pPr>
             <w:r>
               <w:rPr>
                 <w:rFonts w:ascii="Calibri" w:hAnsi="Calibri" w:cs="Calibri"/>
-                <w:b w:val="0"/>
-                <w:i w:val="0"/>
-                <w:color w:val="C1602E"/>
-                <w:sz w:val="52"/>
-              </w:rPr>
-              <w:t>🎥</w:t>
+                <w:b/>
+                <w:i w:val="0"/>
+                <w:color w:val="6B6157"/>
+                <w:sz w:val="15"/>
+              </w:rPr>
+              <w:t>MINIATURA — fotograma do vídeo (inserir)</w:t>
             </w:r>
           </w:p>
           <w:p>
@@ -7211,7 +7275,7 @@
           </w:p>
           <w:p>
             <w:pPr>
-              <w:spacing w:after="0"/>
+              <w:spacing w:before="60" w:after="0"/>
               <w:jc w:val="center"/>
             </w:pPr>
             <w:r>
@@ -7219,15 +7283,15 @@
                 <w:rFonts w:ascii="Calibri" w:hAnsi="Calibri" w:cs="Calibri"/>
                 <w:b/>
                 <w:i w:val="0"/>
-                <w:color w:val="6B6157"/>
-                <w:sz w:val="16"/>
-              </w:rPr>
-              <w:t>MINIATURA (inserir)</w:t>
-            </w:r>
-          </w:p>
-          <w:p>
-            <w:pPr>
-              <w:spacing w:before="80" w:after="0"/>
+                <w:color w:val="0A3A46"/>
+                <w:sz w:val="17"/>
+              </w:rPr>
+              <w:t>Ficheiro:</w:t>
+            </w:r>
+          </w:p>
+          <w:p>
+            <w:pPr>
+              <w:spacing w:after="60"/>
               <w:jc w:val="center"/>
             </w:pPr>
             <w:r>
@@ -7235,24 +7299,8 @@
                 <w:rFonts w:ascii="Calibri" w:hAnsi="Calibri" w:cs="Calibri"/>
                 <w:b/>
                 <w:i w:val="0"/>
-                <w:color w:val="0A3A46"/>
-                <w:sz w:val="17"/>
-              </w:rPr>
-              <w:t>Ficheiro da Biblioteca:</w:t>
-            </w:r>
-          </w:p>
-          <w:p>
-            <w:pPr>
-              <w:spacing w:after="60"/>
-              <w:jc w:val="center"/>
-            </w:pPr>
-            <w:r>
-              <w:rPr>
-                <w:rFonts w:ascii="Calibri" w:hAnsi="Calibri" w:cs="Calibri"/>
-                <w:b/>
-                <w:i w:val="0"/>
                 <w:color w:val="9C4A20"/>
-                <w:sz w:val="20"/>
+                <w:sz w:val="18"/>
               </w:rPr>
               <w:t>002.mp4 (~15s) — vídeo da Biblioteca; alternativas: 003–006.mp4</w:t>
             </w:r>
@@ -7604,23 +7652,63 @@
           </w:tcPr>
           <w:p>
             <w:pPr>
+              <w:spacing w:after="40"/>
+              <w:jc w:val="center"/>
+            </w:pPr>
+            <w:r>
+              <w:drawing>
+                <wp:inline xmlns:a="http://schemas.openxmlformats.org/drawingml/2006/main" xmlns:pic="http://schemas.openxmlformats.org/drawingml/2006/picture">
+                  <wp:extent cx="1620000" cy="2025000"/>
+                  <wp:docPr id="3" name="Picture 3"/>
+                  <wp:cNvGraphicFramePr>
+                    <a:graphicFrameLocks noChangeAspect="1"/>
+                  </wp:cNvGraphicFramePr>
+                  <a:graphic>
+                    <a:graphicData uri="http://schemas.openxmlformats.org/drawingml/2006/picture">
+                      <pic:pic>
+                        <pic:nvPicPr>
+                          <pic:cNvPr id="0" name="thumb_3.jpg"/>
+                          <pic:cNvPicPr/>
+                        </pic:nvPicPr>
+                        <pic:blipFill>
+                          <a:blip r:embed="rId11"/>
+                          <a:stretch>
+                            <a:fillRect/>
+                          </a:stretch>
+                        </pic:blipFill>
+                        <pic:spPr>
+                          <a:xfrm>
+                            <a:off x="0" y="0"/>
+                            <a:ext cx="1620000" cy="2025000"/>
+                          </a:xfrm>
+                          <a:prstGeom prst="rect"/>
+                        </pic:spPr>
+                      </pic:pic>
+                    </a:graphicData>
+                  </a:graphic>
+                </wp:inline>
+              </w:drawing>
+            </w:r>
+          </w:p>
+          <w:p>
+            <w:pPr>
               <w:spacing w:after="20"/>
               <w:jc w:val="center"/>
             </w:pPr>
             <w:r>
               <w:rPr>
                 <w:rFonts w:ascii="Calibri" w:hAnsi="Calibri" w:cs="Calibri"/>
-                <w:b w:val="0"/>
-                <w:i w:val="0"/>
-                <w:color w:val="C1602E"/>
-                <w:sz w:val="52"/>
-              </w:rPr>
-              <w:t>🗂</w:t>
-            </w:r>
-          </w:p>
-          <w:p>
-            <w:pPr>
-              <w:spacing w:after="20"/>
+                <w:b/>
+                <w:i w:val="0"/>
+                <w:color w:val="9C4A20"/>
+                <w:sz w:val="17"/>
+              </w:rPr>
+              <w:t>FORMATO: CARROSSEL</w:t>
+            </w:r>
+          </w:p>
+          <w:p>
+            <w:pPr>
+              <w:spacing w:before="60" w:after="0"/>
               <w:jc w:val="center"/>
             </w:pPr>
             <w:r>
@@ -7628,15 +7716,15 @@
                 <w:rFonts w:ascii="Calibri" w:hAnsi="Calibri" w:cs="Calibri"/>
                 <w:b/>
                 <w:i w:val="0"/>
-                <w:color w:val="9C4A20"/>
+                <w:color w:val="0A3A46"/>
                 <w:sz w:val="17"/>
               </w:rPr>
-              <w:t>FORMATO: CARROSSEL</w:t>
-            </w:r>
-          </w:p>
-          <w:p>
-            <w:pPr>
-              <w:spacing w:after="0"/>
+              <w:t>Ficheiro:</w:t>
+            </w:r>
+          </w:p>
+          <w:p>
+            <w:pPr>
+              <w:spacing w:after="60"/>
               <w:jc w:val="center"/>
             </w:pPr>
             <w:r>
@@ -7644,42 +7732,10 @@
                 <w:rFonts w:ascii="Calibri" w:hAnsi="Calibri" w:cs="Calibri"/>
                 <w:b/>
                 <w:i w:val="0"/>
-                <w:color w:val="6B6157"/>
-                <w:sz w:val="16"/>
-              </w:rPr>
-              <w:t>MINIATURA (inserir)</w:t>
-            </w:r>
-          </w:p>
-          <w:p>
-            <w:pPr>
-              <w:spacing w:before="80" w:after="0"/>
-              <w:jc w:val="center"/>
-            </w:pPr>
-            <w:r>
-              <w:rPr>
-                <w:rFonts w:ascii="Calibri" w:hAnsi="Calibri" w:cs="Calibri"/>
-                <w:b/>
-                <w:i w:val="0"/>
-                <w:color w:val="0A3A46"/>
-                <w:sz w:val="17"/>
-              </w:rPr>
-              <w:t>Ficheiro da Biblioteca:</w:t>
-            </w:r>
-          </w:p>
-          <w:p>
-            <w:pPr>
-              <w:spacing w:after="60"/>
-              <w:jc w:val="center"/>
-            </w:pPr>
-            <w:r>
-              <w:rPr>
-                <w:rFonts w:ascii="Calibri" w:hAnsi="Calibri" w:cs="Calibri"/>
-                <w:b/>
-                <w:i w:val="0"/>
                 <w:color w:val="9C4A20"/>
-                <w:sz w:val="20"/>
-              </w:rPr>
-              <w:t>791A7690, 791A7705, 791A7720, 791A7748 (.JPG) — confirmar</w:t>
+                <w:sz w:val="18"/>
+              </w:rPr>
+              <w:t>Fotos de petiscos (Biblioteca) — 3–4 cartões</w:t>
             </w:r>
           </w:p>
           <w:p>
@@ -7750,7 +7806,7 @@
                 <w:color w:val="23282B"/>
                 <w:sz w:val="20"/>
               </w:rPr>
-              <w:t>Vários pratos e ambiente, um por cartão</w:t>
+              <w:t>Vários petiscos e bebidas para partilhar</w:t>
             </w:r>
           </w:p>
           <w:p>
@@ -7775,7 +7831,7 @@
                 <w:color w:val="6B6157"/>
                 <w:sz w:val="20"/>
               </w:rPr>
-              <w:t>O carrossel mostra a variedade da casa e aproveita bem as 57 fotos; deslizar convida à interação.</w:t>
+              <w:t>O carrossel mostra a variedade da casa; deslizar convida à interação.</w:t>
             </w:r>
           </w:p>
           <w:p>
@@ -8991,23 +9047,63 @@
           </w:tcPr>
           <w:p>
             <w:pPr>
+              <w:spacing w:after="40"/>
+              <w:jc w:val="center"/>
+            </w:pPr>
+            <w:r>
+              <w:drawing>
+                <wp:inline xmlns:a="http://schemas.openxmlformats.org/drawingml/2006/main" xmlns:pic="http://schemas.openxmlformats.org/drawingml/2006/picture">
+                  <wp:extent cx="1620000" cy="2025000"/>
+                  <wp:docPr id="4" name="Picture 4"/>
+                  <wp:cNvGraphicFramePr>
+                    <a:graphicFrameLocks noChangeAspect="1"/>
+                  </wp:cNvGraphicFramePr>
+                  <a:graphic>
+                    <a:graphicData uri="http://schemas.openxmlformats.org/drawingml/2006/picture">
+                      <pic:pic>
+                        <pic:nvPicPr>
+                          <pic:cNvPr id="0" name="thumb_5.jpg"/>
+                          <pic:cNvPicPr/>
+                        </pic:nvPicPr>
+                        <pic:blipFill>
+                          <a:blip r:embed="rId12"/>
+                          <a:stretch>
+                            <a:fillRect/>
+                          </a:stretch>
+                        </pic:blipFill>
+                        <pic:spPr>
+                          <a:xfrm>
+                            <a:off x="0" y="0"/>
+                            <a:ext cx="1620000" cy="2025000"/>
+                          </a:xfrm>
+                          <a:prstGeom prst="rect"/>
+                        </pic:spPr>
+                      </pic:pic>
+                    </a:graphicData>
+                  </a:graphic>
+                </wp:inline>
+              </w:drawing>
+            </w:r>
+          </w:p>
+          <w:p>
+            <w:pPr>
               <w:spacing w:after="20"/>
               <w:jc w:val="center"/>
             </w:pPr>
             <w:r>
               <w:rPr>
                 <w:rFonts w:ascii="Calibri" w:hAnsi="Calibri" w:cs="Calibri"/>
-                <w:b w:val="0"/>
-                <w:i w:val="0"/>
-                <w:color w:val="C1602E"/>
-                <w:sz w:val="52"/>
-              </w:rPr>
-              <w:t>🖼</w:t>
-            </w:r>
-          </w:p>
-          <w:p>
-            <w:pPr>
-              <w:spacing w:after="20"/>
+                <w:b/>
+                <w:i w:val="0"/>
+                <w:color w:val="9C4A20"/>
+                <w:sz w:val="17"/>
+              </w:rPr>
+              <w:t>FORMATO: IMAGEM</w:t>
+            </w:r>
+          </w:p>
+          <w:p>
+            <w:pPr>
+              <w:spacing w:before="60" w:after="0"/>
               <w:jc w:val="center"/>
             </w:pPr>
             <w:r>
@@ -9015,15 +9111,15 @@
                 <w:rFonts w:ascii="Calibri" w:hAnsi="Calibri" w:cs="Calibri"/>
                 <w:b/>
                 <w:i w:val="0"/>
-                <w:color w:val="9C4A20"/>
+                <w:color w:val="0A3A46"/>
                 <w:sz w:val="17"/>
               </w:rPr>
-              <w:t>FORMATO: IMAGEM</w:t>
-            </w:r>
-          </w:p>
-          <w:p>
-            <w:pPr>
-              <w:spacing w:after="0"/>
+              <w:t>Ficheiro:</w:t>
+            </w:r>
+          </w:p>
+          <w:p>
+            <w:pPr>
+              <w:spacing w:after="60"/>
               <w:jc w:val="center"/>
             </w:pPr>
             <w:r>
@@ -9031,42 +9127,10 @@
                 <w:rFonts w:ascii="Calibri" w:hAnsi="Calibri" w:cs="Calibri"/>
                 <w:b/>
                 <w:i w:val="0"/>
-                <w:color w:val="6B6157"/>
-                <w:sz w:val="16"/>
-              </w:rPr>
-              <w:t>MINIATURA (inserir)</w:t>
-            </w:r>
-          </w:p>
-          <w:p>
-            <w:pPr>
-              <w:spacing w:before="80" w:after="0"/>
-              <w:jc w:val="center"/>
-            </w:pPr>
-            <w:r>
-              <w:rPr>
-                <w:rFonts w:ascii="Calibri" w:hAnsi="Calibri" w:cs="Calibri"/>
-                <w:b/>
-                <w:i w:val="0"/>
-                <w:color w:val="0A3A46"/>
-                <w:sz w:val="17"/>
-              </w:rPr>
-              <w:t>Ficheiro da Biblioteca:</w:t>
-            </w:r>
-          </w:p>
-          <w:p>
-            <w:pPr>
-              <w:spacing w:after="60"/>
-              <w:jc w:val="center"/>
-            </w:pPr>
-            <w:r>
-              <w:rPr>
-                <w:rFonts w:ascii="Calibri" w:hAnsi="Calibri" w:cs="Calibri"/>
-                <w:b/>
-                <w:i w:val="0"/>
                 <w:color w:val="9C4A20"/>
-                <w:sz w:val="20"/>
-              </w:rPr>
-              <w:t>791A7728.JPG — confirmar no Ads Manager</w:t>
+                <w:sz w:val="18"/>
+              </w:rPr>
+              <w:t>Foto do peixe grelhado (Biblioteca) — a confirmar no Ads Manager</w:t>
             </w:r>
           </w:p>
           <w:p>
@@ -9137,7 +9201,7 @@
                 <w:color w:val="23282B"/>
                 <w:sz w:val="20"/>
               </w:rPr>
-              <w:t>Bacalhau ou tamboril (prato-âncora) em grande plano apetitoso</w:t>
+              <w:t>Peixe fresco grelhado com batata a murro e salada</w:t>
             </w:r>
           </w:p>
           <w:p>
@@ -9162,7 +9226,7 @@
                 <w:color w:val="6B6157"/>
                 <w:sz w:val="20"/>
               </w:rPr>
-              <w:t>Prato-âncora reconhecível que gera desejo imediato e empurra para o botão 'Enviar mensagem'.</w:t>
+              <w:t>Prato-âncora que gera desejo imediato e empurra para o botão 'Enviar mensagem'.</w:t>
             </w:r>
           </w:p>
           <w:p>
@@ -9202,7 +9266,7 @@
                 <w:color w:val="23282B"/>
                 <w:sz w:val="20"/>
               </w:rPr>
-              <w:t>Bacalhau e tamboril como devem ser: frescos, bem temperados e sem pressa. 🐟 Na Tasca da Maria, na marginal da Póvoa, a qualidade vem sempre primeiro. Sala pequena — reserve já pelo WhatsApp. 📲</w:t>
+              <w:t>Peixe fresco grelhado, do dia, como deve ser. 🐟 Na Tasca da Maria, na marginal da Póvoa, a qualidade vem sempre primeiro. Sala pequena — reserve já pelo WhatsApp. 📲</w:t>
             </w:r>
           </w:p>
           <w:p>
@@ -9227,7 +9291,7 @@
                 <w:color w:val="23282B"/>
                 <w:sz w:val="20"/>
               </w:rPr>
-              <w:t>Bacalhau e tamboril fresquinhos</w:t>
+              <w:t>Peixe fresco grelhado na Póvoa</w:t>
             </w:r>
           </w:p>
           <w:p>
@@ -9416,18 +9480,34 @@
           </w:tcPr>
           <w:p>
             <w:pPr>
+              <w:spacing w:after="40"/>
+              <w:jc w:val="center"/>
+            </w:pPr>
+            <w:r>
+              <w:rPr>
+                <w:rFonts w:ascii="Calibri" w:hAnsi="Calibri" w:cs="Calibri"/>
+                <w:b w:val="0"/>
+                <w:i w:val="0"/>
+                <w:color w:val="C1602E"/>
+                <w:sz w:val="52"/>
+              </w:rPr>
+              <w:t>🎥</w:t>
+            </w:r>
+          </w:p>
+          <w:p>
+            <w:pPr>
               <w:spacing w:after="20"/>
               <w:jc w:val="center"/>
             </w:pPr>
             <w:r>
               <w:rPr>
                 <w:rFonts w:ascii="Calibri" w:hAnsi="Calibri" w:cs="Calibri"/>
-                <w:b w:val="0"/>
-                <w:i w:val="0"/>
-                <w:color w:val="C1602E"/>
-                <w:sz w:val="52"/>
-              </w:rPr>
-              <w:t>🎥</w:t>
+                <w:b/>
+                <w:i w:val="0"/>
+                <w:color w:val="6B6157"/>
+                <w:sz w:val="15"/>
+              </w:rPr>
+              <w:t>MINIATURA — fotograma do vídeo (inserir)</w:t>
             </w:r>
           </w:p>
           <w:p>
@@ -9448,7 +9528,7 @@
           </w:p>
           <w:p>
             <w:pPr>
-              <w:spacing w:after="0"/>
+              <w:spacing w:before="60" w:after="0"/>
               <w:jc w:val="center"/>
             </w:pPr>
             <w:r>
@@ -9456,15 +9536,15 @@
                 <w:rFonts w:ascii="Calibri" w:hAnsi="Calibri" w:cs="Calibri"/>
                 <w:b/>
                 <w:i w:val="0"/>
-                <w:color w:val="6B6157"/>
-                <w:sz w:val="16"/>
-              </w:rPr>
-              <w:t>MINIATURA (inserir)</w:t>
-            </w:r>
-          </w:p>
-          <w:p>
-            <w:pPr>
-              <w:spacing w:before="80" w:after="0"/>
+                <w:color w:val="0A3A46"/>
+                <w:sz w:val="17"/>
+              </w:rPr>
+              <w:t>Ficheiro:</w:t>
+            </w:r>
+          </w:p>
+          <w:p>
+            <w:pPr>
+              <w:spacing w:after="60"/>
               <w:jc w:val="center"/>
             </w:pPr>
             <w:r>
@@ -9472,24 +9552,8 @@
                 <w:rFonts w:ascii="Calibri" w:hAnsi="Calibri" w:cs="Calibri"/>
                 <w:b/>
                 <w:i w:val="0"/>
-                <w:color w:val="0A3A46"/>
-                <w:sz w:val="17"/>
-              </w:rPr>
-              <w:t>Ficheiro da Biblioteca:</w:t>
-            </w:r>
-          </w:p>
-          <w:p>
-            <w:pPr>
-              <w:spacing w:after="60"/>
-              <w:jc w:val="center"/>
-            </w:pPr>
-            <w:r>
-              <w:rPr>
-                <w:rFonts w:ascii="Calibri" w:hAnsi="Calibri" w:cs="Calibri"/>
-                <w:b/>
-                <w:i w:val="0"/>
                 <w:color w:val="9C4A20"/>
-                <w:sz w:val="20"/>
+                <w:sz w:val="18"/>
               </w:rPr>
               <w:t>007.mp4 (~30s) — vídeo da Biblioteca; alternativas: 003.mp4, 005.mp4</w:t>
             </w:r>
@@ -9841,23 +9905,63 @@
           </w:tcPr>
           <w:p>
             <w:pPr>
+              <w:spacing w:after="40"/>
+              <w:jc w:val="center"/>
+            </w:pPr>
+            <w:r>
+              <w:drawing>
+                <wp:inline xmlns:a="http://schemas.openxmlformats.org/drawingml/2006/main" xmlns:pic="http://schemas.openxmlformats.org/drawingml/2006/picture">
+                  <wp:extent cx="1620000" cy="2025000"/>
+                  <wp:docPr id="5" name="Picture 5"/>
+                  <wp:cNvGraphicFramePr>
+                    <a:graphicFrameLocks noChangeAspect="1"/>
+                  </wp:cNvGraphicFramePr>
+                  <a:graphic>
+                    <a:graphicData uri="http://schemas.openxmlformats.org/drawingml/2006/picture">
+                      <pic:pic>
+                        <pic:nvPicPr>
+                          <pic:cNvPr id="0" name="thumb_4.jpg"/>
+                          <pic:cNvPicPr/>
+                        </pic:nvPicPr>
+                        <pic:blipFill>
+                          <a:blip r:embed="rId13"/>
+                          <a:stretch>
+                            <a:fillRect/>
+                          </a:stretch>
+                        </pic:blipFill>
+                        <pic:spPr>
+                          <a:xfrm>
+                            <a:off x="0" y="0"/>
+                            <a:ext cx="1620000" cy="2025000"/>
+                          </a:xfrm>
+                          <a:prstGeom prst="rect"/>
+                        </pic:spPr>
+                      </pic:pic>
+                    </a:graphicData>
+                  </a:graphic>
+                </wp:inline>
+              </w:drawing>
+            </w:r>
+          </w:p>
+          <w:p>
+            <w:pPr>
               <w:spacing w:after="20"/>
               <w:jc w:val="center"/>
             </w:pPr>
             <w:r>
               <w:rPr>
                 <w:rFonts w:ascii="Calibri" w:hAnsi="Calibri" w:cs="Calibri"/>
-                <w:b w:val="0"/>
-                <w:i w:val="0"/>
-                <w:color w:val="C1602E"/>
-                <w:sz w:val="52"/>
-              </w:rPr>
-              <w:t>🗂</w:t>
-            </w:r>
-          </w:p>
-          <w:p>
-            <w:pPr>
-              <w:spacing w:after="20"/>
+                <w:b/>
+                <w:i w:val="0"/>
+                <w:color w:val="9C4A20"/>
+                <w:sz w:val="17"/>
+              </w:rPr>
+              <w:t>FORMATO: CARROSSEL</w:t>
+            </w:r>
+          </w:p>
+          <w:p>
+            <w:pPr>
+              <w:spacing w:before="60" w:after="0"/>
               <w:jc w:val="center"/>
             </w:pPr>
             <w:r>
@@ -9865,15 +9969,15 @@
                 <w:rFonts w:ascii="Calibri" w:hAnsi="Calibri" w:cs="Calibri"/>
                 <w:b/>
                 <w:i w:val="0"/>
-                <w:color w:val="9C4A20"/>
+                <w:color w:val="0A3A46"/>
                 <w:sz w:val="17"/>
               </w:rPr>
-              <w:t>FORMATO: CARROSSEL</w:t>
-            </w:r>
-          </w:p>
-          <w:p>
-            <w:pPr>
-              <w:spacing w:after="0"/>
+              <w:t>Ficheiro:</w:t>
+            </w:r>
+          </w:p>
+          <w:p>
+            <w:pPr>
+              <w:spacing w:after="60"/>
               <w:jc w:val="center"/>
             </w:pPr>
             <w:r>
@@ -9881,42 +9985,10 @@
                 <w:rFonts w:ascii="Calibri" w:hAnsi="Calibri" w:cs="Calibri"/>
                 <w:b/>
                 <w:i w:val="0"/>
-                <w:color w:val="6B6157"/>
-                <w:sz w:val="16"/>
-              </w:rPr>
-              <w:t>MINIATURA (inserir)</w:t>
-            </w:r>
-          </w:p>
-          <w:p>
-            <w:pPr>
-              <w:spacing w:before="80" w:after="0"/>
-              <w:jc w:val="center"/>
-            </w:pPr>
-            <w:r>
-              <w:rPr>
-                <w:rFonts w:ascii="Calibri" w:hAnsi="Calibri" w:cs="Calibri"/>
-                <w:b/>
-                <w:i w:val="0"/>
-                <w:color w:val="0A3A46"/>
-                <w:sz w:val="17"/>
-              </w:rPr>
-              <w:t>Ficheiro da Biblioteca:</w:t>
-            </w:r>
-          </w:p>
-          <w:p>
-            <w:pPr>
-              <w:spacing w:after="60"/>
-              <w:jc w:val="center"/>
-            </w:pPr>
-            <w:r>
-              <w:rPr>
-                <w:rFonts w:ascii="Calibri" w:hAnsi="Calibri" w:cs="Calibri"/>
-                <w:b/>
-                <w:i w:val="0"/>
                 <w:color w:val="9C4A20"/>
-                <w:sz w:val="20"/>
-              </w:rPr>
-              <w:t>791A7690, 791A7720, 791A7733, 791A7748 (.JPG) — confirmar</w:t>
+                <w:sz w:val="18"/>
+              </w:rPr>
+              <w:t>Fotos de pratos (Biblioteca) — 4 cartões</w:t>
             </w:r>
           </w:p>
           <w:p>
@@ -9987,7 +10059,7 @@
                 <w:color w:val="23282B"/>
                 <w:sz w:val="20"/>
               </w:rPr>
-              <w:t>Marisco, bacalhau, alheira e sobremesa — um por cartão</w:t>
+              <w:t>Pratos fartos e variados (arroz de carne, peixe, petiscos)</w:t>
             </w:r>
           </w:p>
           <w:p>
@@ -16354,7 +16426,7 @@
       </w:r>
     </w:p>
     <w:sectPr>
-      <w:footerReference w:type="default" r:id="rId9"/>
+      <w:footerReference w:type="default" r:id="rId14"/>
       <w:pgSz w:w="12240" w:h="15840"/>
       <w:pgMar w:top="907" w:right="1077" w:bottom="907" w:left="1077" w:header="720" w:footer="720" w:gutter="0"/>
       <w:cols w:space="720"/>

</xml_diff>